<commit_message>
Đăng ký, Đăng nhập và Chỉnh sửa CSDL
</commit_message>
<xml_diff>
--- a/CSDL_1.docx
+++ b/CSDL_1.docx
@@ -58,7 +58,19 @@
         <w:rPr>
           <w:rFonts w:ascii="Times New Roman" w:hAnsi="Times New Roman" w:cs="Times New Roman"/>
         </w:rPr>
-        <w:t>Users (Người dùng)</w:t>
+        <w:t>User</w:t>
+      </w:r>
+      <w:r>
+        <w:rPr>
+          <w:rFonts w:ascii="Times New Roman" w:hAnsi="Times New Roman" w:cs="Times New Roman"/>
+        </w:rPr>
+        <w:t>s</w:t>
+      </w:r>
+      <w:r>
+        <w:rPr>
+          <w:rFonts w:ascii="Times New Roman" w:hAnsi="Times New Roman" w:cs="Times New Roman"/>
+        </w:rPr>
+        <w:t xml:space="preserve"> (Người dùng)</w:t>
       </w:r>
       <w:r>
         <w:rPr>
@@ -1681,6 +1693,92 @@
         </w:rPr>
         <w:t xml:space="preserve"> TEXT</w:t>
       </w:r>
+      <w:r>
+        <w:rPr>
+          <w:rFonts w:ascii="Times New Roman" w:hAnsi="Times New Roman" w:cs="Times New Roman"/>
+        </w:rPr>
+        <w:t>,</w:t>
+      </w:r>
+    </w:p>
+    <w:p>
+      <w:pPr>
+        <w:pStyle w:val="ListParagraph"/>
+        <w:ind w:left="1440"/>
+        <w:rPr>
+          <w:rFonts w:ascii="Times New Roman" w:hAnsi="Times New Roman" w:cs="Times New Roman"/>
+        </w:rPr>
+      </w:pPr>
+      <w:r>
+        <w:rPr>
+          <w:rFonts w:ascii="Times New Roman" w:hAnsi="Times New Roman" w:cs="Times New Roman"/>
+        </w:rPr>
+        <w:t xml:space="preserve">    id_user </w:t>
+      </w:r>
+      <w:proofErr w:type="gramStart"/>
+      <w:r>
+        <w:rPr>
+          <w:rFonts w:ascii="Times New Roman" w:hAnsi="Times New Roman" w:cs="Times New Roman"/>
+        </w:rPr>
+        <w:t>NVARCHAR(</w:t>
+      </w:r>
+      <w:proofErr w:type="gramEnd"/>
+      <w:r>
+        <w:rPr>
+          <w:rFonts w:ascii="Times New Roman" w:hAnsi="Times New Roman" w:cs="Times New Roman"/>
+        </w:rPr>
+        <w:t>10),</w:t>
+      </w:r>
+    </w:p>
+    <w:p>
+      <w:pPr>
+        <w:pStyle w:val="ListParagraph"/>
+        <w:ind w:left="1440"/>
+        <w:rPr>
+          <w:rFonts w:ascii="Times New Roman" w:hAnsi="Times New Roman" w:cs="Times New Roman"/>
+        </w:rPr>
+      </w:pPr>
+      <w:r>
+        <w:rPr>
+          <w:rFonts w:ascii="Times New Roman" w:hAnsi="Times New Roman" w:cs="Times New Roman"/>
+        </w:rPr>
+        <w:t xml:space="preserve">    FOREIGN KEY (</w:t>
+      </w:r>
+      <w:r>
+        <w:rPr>
+          <w:rFonts w:ascii="Times New Roman" w:hAnsi="Times New Roman" w:cs="Times New Roman"/>
+        </w:rPr>
+        <w:t>id_user</w:t>
+      </w:r>
+      <w:r>
+        <w:rPr>
+          <w:rFonts w:ascii="Times New Roman" w:hAnsi="Times New Roman" w:cs="Times New Roman"/>
+        </w:rPr>
+        <w:t>) REFERENCES User</w:t>
+      </w:r>
+      <w:r>
+        <w:rPr>
+          <w:rFonts w:ascii="Times New Roman" w:hAnsi="Times New Roman" w:cs="Times New Roman"/>
+        </w:rPr>
+        <w:t>s</w:t>
+      </w:r>
+      <w:r>
+        <w:rPr>
+          <w:rFonts w:ascii="Times New Roman" w:hAnsi="Times New Roman" w:cs="Times New Roman"/>
+        </w:rPr>
+        <w:t>(</w:t>
+      </w:r>
+      <w:r>
+        <w:rPr>
+          <w:rFonts w:ascii="Times New Roman" w:hAnsi="Times New Roman" w:cs="Times New Roman"/>
+        </w:rPr>
+        <w:t>id_user</w:t>
+      </w:r>
+      <w:r>
+        <w:rPr>
+          <w:rFonts w:ascii="Times New Roman" w:hAnsi="Times New Roman" w:cs="Times New Roman"/>
+        </w:rPr>
+        <w:t>) ON DELETE CASCADE</w:t>
+      </w:r>
     </w:p>
     <w:p>
       <w:pPr>
@@ -1773,6 +1871,29 @@
         </w:rPr>
         <w:t xml:space="preserve"> </w:t>
       </w:r>
+      <w:r>
+        <w:rPr>
+          <w:rFonts w:ascii="Times New Roman" w:hAnsi="Times New Roman" w:cs="Times New Roman"/>
+          <w:color w:val="FF0000"/>
+        </w:rPr>
+        <w:t>(</w:t>
+      </w:r>
+      <w:r>
+        <w:rPr>
+          <w:rFonts w:ascii="Times New Roman" w:hAnsi="Times New Roman" w:cs="Times New Roman"/>
+          <w:b/>
+          <w:bCs/>
+          <w:color w:val="000000" w:themeColor="text1"/>
+        </w:rPr>
+        <w:t>Bỏ tạm thời</w:t>
+      </w:r>
+      <w:r>
+        <w:rPr>
+          <w:rFonts w:ascii="Times New Roman" w:hAnsi="Times New Roman" w:cs="Times New Roman"/>
+          <w:color w:val="FF0000"/>
+        </w:rPr>
+        <w:t>)</w:t>
+      </w:r>
     </w:p>
     <w:p>
       <w:pPr>
@@ -2645,100 +2766,6 @@
         <w:rPr>
           <w:rFonts w:ascii="Times New Roman" w:hAnsi="Times New Roman" w:cs="Times New Roman"/>
         </w:rPr>
-        <w:t xml:space="preserve">    </w:t>
-      </w:r>
-      <w:r>
-        <w:rPr>
-          <w:rFonts w:ascii="Times New Roman" w:hAnsi="Times New Roman" w:cs="Times New Roman"/>
-        </w:rPr>
-        <w:t>id_playlist</w:t>
-      </w:r>
-      <w:r>
-        <w:rPr>
-          <w:rFonts w:ascii="Times New Roman" w:hAnsi="Times New Roman" w:cs="Times New Roman"/>
-        </w:rPr>
-        <w:t xml:space="preserve"> </w:t>
-      </w:r>
-      <w:proofErr w:type="gramStart"/>
-      <w:r>
-        <w:rPr>
-          <w:rFonts w:ascii="Times New Roman" w:hAnsi="Times New Roman" w:cs="Times New Roman"/>
-        </w:rPr>
-        <w:t>NVARCHAR(</w:t>
-      </w:r>
-      <w:proofErr w:type="gramEnd"/>
-      <w:r>
-        <w:rPr>
-          <w:rFonts w:ascii="Times New Roman" w:hAnsi="Times New Roman" w:cs="Times New Roman"/>
-        </w:rPr>
-        <w:t>10)</w:t>
-      </w:r>
-      <w:r>
-        <w:rPr>
-          <w:rFonts w:ascii="Times New Roman" w:hAnsi="Times New Roman" w:cs="Times New Roman"/>
-        </w:rPr>
-        <w:t xml:space="preserve"> </w:t>
-      </w:r>
-      <w:r>
-        <w:rPr>
-          <w:rFonts w:ascii="Times New Roman" w:hAnsi="Times New Roman" w:cs="Times New Roman"/>
-        </w:rPr>
-        <w:t>PRIMARY KEY,</w:t>
-      </w:r>
-    </w:p>
-    <w:p>
-      <w:pPr>
-        <w:pStyle w:val="ListParagraph"/>
-        <w:ind w:left="1440"/>
-        <w:rPr>
-          <w:rFonts w:ascii="Times New Roman" w:hAnsi="Times New Roman" w:cs="Times New Roman"/>
-        </w:rPr>
-      </w:pPr>
-      <w:r>
-        <w:rPr>
-          <w:rFonts w:ascii="Times New Roman" w:hAnsi="Times New Roman" w:cs="Times New Roman"/>
-        </w:rPr>
-        <w:t xml:space="preserve">    </w:t>
-      </w:r>
-      <w:r>
-        <w:rPr>
-          <w:rFonts w:ascii="Times New Roman" w:hAnsi="Times New Roman" w:cs="Times New Roman"/>
-        </w:rPr>
-        <w:t>ten</w:t>
-      </w:r>
-      <w:r>
-        <w:rPr>
-          <w:rFonts w:ascii="Times New Roman" w:hAnsi="Times New Roman" w:cs="Times New Roman"/>
-        </w:rPr>
-        <w:t xml:space="preserve"> </w:t>
-      </w:r>
-      <w:proofErr w:type="gramStart"/>
-      <w:r>
-        <w:rPr>
-          <w:rFonts w:ascii="Times New Roman" w:hAnsi="Times New Roman" w:cs="Times New Roman"/>
-        </w:rPr>
-        <w:t>NVARCHAR(</w:t>
-      </w:r>
-      <w:proofErr w:type="gramEnd"/>
-      <w:r>
-        <w:rPr>
-          <w:rFonts w:ascii="Times New Roman" w:hAnsi="Times New Roman" w:cs="Times New Roman"/>
-        </w:rPr>
-        <w:t>25) NOT NULL,</w:t>
-      </w:r>
-    </w:p>
-    <w:p>
-      <w:pPr>
-        <w:pStyle w:val="ListParagraph"/>
-        <w:ind w:left="1440"/>
-        <w:rPr>
-          <w:rFonts w:ascii="Times New Roman" w:hAnsi="Times New Roman" w:cs="Times New Roman"/>
-        </w:rPr>
-      </w:pPr>
-      <w:r>
-        <w:rPr>
-          <w:rFonts w:ascii="Times New Roman" w:hAnsi="Times New Roman" w:cs="Times New Roman"/>
-        </w:rPr>
         <w:lastRenderedPageBreak/>
         <w:t xml:space="preserve">    </w:t>
       </w:r>
@@ -2746,6 +2773,100 @@
         <w:rPr>
           <w:rFonts w:ascii="Times New Roman" w:hAnsi="Times New Roman" w:cs="Times New Roman"/>
         </w:rPr>
+        <w:t>id_playlist</w:t>
+      </w:r>
+      <w:r>
+        <w:rPr>
+          <w:rFonts w:ascii="Times New Roman" w:hAnsi="Times New Roman" w:cs="Times New Roman"/>
+        </w:rPr>
+        <w:t xml:space="preserve"> </w:t>
+      </w:r>
+      <w:proofErr w:type="gramStart"/>
+      <w:r>
+        <w:rPr>
+          <w:rFonts w:ascii="Times New Roman" w:hAnsi="Times New Roman" w:cs="Times New Roman"/>
+        </w:rPr>
+        <w:t>NVARCHAR(</w:t>
+      </w:r>
+      <w:proofErr w:type="gramEnd"/>
+      <w:r>
+        <w:rPr>
+          <w:rFonts w:ascii="Times New Roman" w:hAnsi="Times New Roman" w:cs="Times New Roman"/>
+        </w:rPr>
+        <w:t>10)</w:t>
+      </w:r>
+      <w:r>
+        <w:rPr>
+          <w:rFonts w:ascii="Times New Roman" w:hAnsi="Times New Roman" w:cs="Times New Roman"/>
+        </w:rPr>
+        <w:t xml:space="preserve"> </w:t>
+      </w:r>
+      <w:r>
+        <w:rPr>
+          <w:rFonts w:ascii="Times New Roman" w:hAnsi="Times New Roman" w:cs="Times New Roman"/>
+        </w:rPr>
+        <w:t>PRIMARY KEY,</w:t>
+      </w:r>
+    </w:p>
+    <w:p>
+      <w:pPr>
+        <w:pStyle w:val="ListParagraph"/>
+        <w:ind w:left="1440"/>
+        <w:rPr>
+          <w:rFonts w:ascii="Times New Roman" w:hAnsi="Times New Roman" w:cs="Times New Roman"/>
+        </w:rPr>
+      </w:pPr>
+      <w:r>
+        <w:rPr>
+          <w:rFonts w:ascii="Times New Roman" w:hAnsi="Times New Roman" w:cs="Times New Roman"/>
+        </w:rPr>
+        <w:t xml:space="preserve">    </w:t>
+      </w:r>
+      <w:r>
+        <w:rPr>
+          <w:rFonts w:ascii="Times New Roman" w:hAnsi="Times New Roman" w:cs="Times New Roman"/>
+        </w:rPr>
+        <w:t>ten</w:t>
+      </w:r>
+      <w:r>
+        <w:rPr>
+          <w:rFonts w:ascii="Times New Roman" w:hAnsi="Times New Roman" w:cs="Times New Roman"/>
+        </w:rPr>
+        <w:t xml:space="preserve"> </w:t>
+      </w:r>
+      <w:proofErr w:type="gramStart"/>
+      <w:r>
+        <w:rPr>
+          <w:rFonts w:ascii="Times New Roman" w:hAnsi="Times New Roman" w:cs="Times New Roman"/>
+        </w:rPr>
+        <w:t>NVARCHAR(</w:t>
+      </w:r>
+      <w:proofErr w:type="gramEnd"/>
+      <w:r>
+        <w:rPr>
+          <w:rFonts w:ascii="Times New Roman" w:hAnsi="Times New Roman" w:cs="Times New Roman"/>
+        </w:rPr>
+        <w:t>25) NOT NULL,</w:t>
+      </w:r>
+    </w:p>
+    <w:p>
+      <w:pPr>
+        <w:pStyle w:val="ListParagraph"/>
+        <w:ind w:left="1440"/>
+        <w:rPr>
+          <w:rFonts w:ascii="Times New Roman" w:hAnsi="Times New Roman" w:cs="Times New Roman"/>
+        </w:rPr>
+      </w:pPr>
+      <w:r>
+        <w:rPr>
+          <w:rFonts w:ascii="Times New Roman" w:hAnsi="Times New Roman" w:cs="Times New Roman"/>
+        </w:rPr>
+        <w:t xml:space="preserve">    </w:t>
+      </w:r>
+      <w:r>
+        <w:rPr>
+          <w:rFonts w:ascii="Times New Roman" w:hAnsi="Times New Roman" w:cs="Times New Roman"/>
+        </w:rPr>
         <w:t>id_user</w:t>
       </w:r>
       <w:r>
@@ -2846,7 +2967,19 @@
         <w:rPr>
           <w:rFonts w:ascii="Times New Roman" w:hAnsi="Times New Roman" w:cs="Times New Roman"/>
         </w:rPr>
-        <w:t>) REFERENCES User(</w:t>
+        <w:t>) REFERENCES User</w:t>
+      </w:r>
+      <w:r>
+        <w:rPr>
+          <w:rFonts w:ascii="Times New Roman" w:hAnsi="Times New Roman" w:cs="Times New Roman"/>
+        </w:rPr>
+        <w:t>s</w:t>
+      </w:r>
+      <w:r>
+        <w:rPr>
+          <w:rFonts w:ascii="Times New Roman" w:hAnsi="Times New Roman" w:cs="Times New Roman"/>
+        </w:rPr>
+        <w:t>(</w:t>
       </w:r>
       <w:r>
         <w:rPr>
@@ -3534,7 +3667,19 @@
         <w:rPr>
           <w:rFonts w:ascii="Times New Roman" w:hAnsi="Times New Roman" w:cs="Times New Roman"/>
         </w:rPr>
-        <w:t>) REFERENCES User(</w:t>
+        <w:t>) REFERENCES User</w:t>
+      </w:r>
+      <w:r>
+        <w:rPr>
+          <w:rFonts w:ascii="Times New Roman" w:hAnsi="Times New Roman" w:cs="Times New Roman"/>
+        </w:rPr>
+        <w:t>s</w:t>
+      </w:r>
+      <w:r>
+        <w:rPr>
+          <w:rFonts w:ascii="Times New Roman" w:hAnsi="Times New Roman" w:cs="Times New Roman"/>
+        </w:rPr>
+        <w:t>(</w:t>
       </w:r>
       <w:r>
         <w:rPr>
@@ -3917,7 +4062,19 @@
         <w:rPr>
           <w:rFonts w:ascii="Times New Roman" w:hAnsi="Times New Roman" w:cs="Times New Roman"/>
         </w:rPr>
-        <w:t>) REFERENCES User(</w:t>
+        <w:t>) REFERENCES User</w:t>
+      </w:r>
+      <w:r>
+        <w:rPr>
+          <w:rFonts w:ascii="Times New Roman" w:hAnsi="Times New Roman" w:cs="Times New Roman"/>
+        </w:rPr>
+        <w:t>s</w:t>
+      </w:r>
+      <w:r>
+        <w:rPr>
+          <w:rFonts w:ascii="Times New Roman" w:hAnsi="Times New Roman" w:cs="Times New Roman"/>
+        </w:rPr>
+        <w:t>(</w:t>
       </w:r>
       <w:r>
         <w:rPr>
@@ -4276,6 +4433,7 @@
         <w:rPr>
           <w:rFonts w:ascii="Times New Roman" w:hAnsi="Times New Roman" w:cs="Times New Roman"/>
         </w:rPr>
+        <w:lastRenderedPageBreak/>
         <w:t xml:space="preserve">    phanhoi TEXT ALLOW NULL,</w:t>
       </w:r>
     </w:p>
@@ -4332,7 +4490,6 @@
         <w:rPr>
           <w:rFonts w:ascii="Times New Roman" w:hAnsi="Times New Roman" w:cs="Times New Roman"/>
         </w:rPr>
-        <w:lastRenderedPageBreak/>
         <w:t xml:space="preserve">    FOREIGN KEY (</w:t>
       </w:r>
       <w:r>
@@ -4345,7 +4502,19 @@
         <w:rPr>
           <w:rFonts w:ascii="Times New Roman" w:hAnsi="Times New Roman" w:cs="Times New Roman"/>
         </w:rPr>
-        <w:t>) REFERENCES User(</w:t>
+        <w:t>) REFERENCES User</w:t>
+      </w:r>
+      <w:r>
+        <w:rPr>
+          <w:rFonts w:ascii="Times New Roman" w:hAnsi="Times New Roman" w:cs="Times New Roman"/>
+        </w:rPr>
+        <w:t>s</w:t>
+      </w:r>
+      <w:r>
+        <w:rPr>
+          <w:rFonts w:ascii="Times New Roman" w:hAnsi="Times New Roman" w:cs="Times New Roman"/>
+        </w:rPr>
+        <w:t>(</w:t>
       </w:r>
       <w:r>
         <w:rPr>
@@ -4798,7 +4967,19 @@
         <w:rPr>
           <w:rFonts w:ascii="Times New Roman" w:hAnsi="Times New Roman" w:cs="Times New Roman"/>
         </w:rPr>
-        <w:t>) REFERENCES User(</w:t>
+        <w:t>) REFERENCES User</w:t>
+      </w:r>
+      <w:r>
+        <w:rPr>
+          <w:rFonts w:ascii="Times New Roman" w:hAnsi="Times New Roman" w:cs="Times New Roman"/>
+        </w:rPr>
+        <w:t>s</w:t>
+      </w:r>
+      <w:r>
+        <w:rPr>
+          <w:rFonts w:ascii="Times New Roman" w:hAnsi="Times New Roman" w:cs="Times New Roman"/>
+        </w:rPr>
+        <w:t>(</w:t>
       </w:r>
       <w:r>
         <w:rPr>
@@ -5598,7 +5779,19 @@
         <w:rPr>
           <w:rFonts w:ascii="Times New Roman" w:hAnsi="Times New Roman" w:cs="Times New Roman"/>
         </w:rPr>
-        <w:t xml:space="preserve">    FOREIGN KEY (id_user) REFERENCES User(id_user),</w:t>
+        <w:t xml:space="preserve">    FOREIGN KEY (id_user) REFERENCES User</w:t>
+      </w:r>
+      <w:r>
+        <w:rPr>
+          <w:rFonts w:ascii="Times New Roman" w:hAnsi="Times New Roman" w:cs="Times New Roman"/>
+        </w:rPr>
+        <w:t>s</w:t>
+      </w:r>
+      <w:r>
+        <w:rPr>
+          <w:rFonts w:ascii="Times New Roman" w:hAnsi="Times New Roman" w:cs="Times New Roman"/>
+        </w:rPr>
+        <w:t>(id_user),</w:t>
       </w:r>
     </w:p>
     <w:p>
@@ -5721,6 +5914,7 @@
         <w:rPr>
           <w:rFonts w:ascii="Times New Roman" w:hAnsi="Times New Roman" w:cs="Times New Roman"/>
         </w:rPr>
+        <w:lastRenderedPageBreak/>
         <w:t xml:space="preserve">CREATE TABLE </w:t>
       </w:r>
       <w:r>
@@ -5777,7 +5971,6 @@
         <w:rPr>
           <w:rFonts w:ascii="Times New Roman" w:hAnsi="Times New Roman" w:cs="Times New Roman"/>
         </w:rPr>
-        <w:lastRenderedPageBreak/>
         <w:t xml:space="preserve">    </w:t>
       </w:r>
       <w:r>
@@ -6048,7 +6241,19 @@
         <w:rPr>
           <w:rFonts w:ascii="Times New Roman" w:hAnsi="Times New Roman" w:cs="Times New Roman"/>
         </w:rPr>
-        <w:t xml:space="preserve">    FOREIGN KEY (id_user) REFERENCES User(id_user),</w:t>
+        <w:t xml:space="preserve">    FOREIGN KEY (id_user) REFERENCES User</w:t>
+      </w:r>
+      <w:r>
+        <w:rPr>
+          <w:rFonts w:ascii="Times New Roman" w:hAnsi="Times New Roman" w:cs="Times New Roman"/>
+        </w:rPr>
+        <w:t>s</w:t>
+      </w:r>
+      <w:r>
+        <w:rPr>
+          <w:rFonts w:ascii="Times New Roman" w:hAnsi="Times New Roman" w:cs="Times New Roman"/>
+        </w:rPr>
+        <w:t>(id_user),</w:t>
       </w:r>
     </w:p>
     <w:p>

</xml_diff>